<commit_message>
Fixing some backend issues
</commit_message>
<xml_diff>
--- a/testing_evidence.docx
+++ b/testing_evidence.docx
@@ -575,6 +575,9 @@
     </w:p>
     <w:p>
       <w:r>
+        <w:rPr>
+          <w:noProof/>
+        </w:rPr>
         <w:lastRenderedPageBreak/>
         <w:drawing>
           <wp:inline distT="0" distB="0" distL="0" distR="0" wp14:anchorId="40741EDD" wp14:editId="7B80F082">
@@ -617,24 +620,40 @@
     <w:p/>
     <w:p>
       <w:r>
-        <w:t>We have also encounter 500</w:t>
+        <w:t xml:space="preserve">We have also </w:t>
+      </w:r>
+      <w:proofErr w:type="gramStart"/>
+      <w:r>
+        <w:t>encounter</w:t>
+      </w:r>
+      <w:proofErr w:type="gramEnd"/>
+      <w:r>
+        <w:t xml:space="preserve"> 500</w:t>
       </w:r>
       <w:r>
         <w:t xml:space="preserve"> Internal Server Error responses </w:t>
       </w:r>
       <w:r>
-        <w:t xml:space="preserve">while testing and these </w:t>
+        <w:t xml:space="preserve">while testing and </w:t>
       </w:r>
-      <w:proofErr w:type="spellStart"/>
+      <w:proofErr w:type="gramStart"/>
       <w:r>
-        <w:t>screenshoot</w:t>
+        <w:t>these screenshot</w:t>
       </w:r>
-      <w:proofErr w:type="spellEnd"/>
+      <w:proofErr w:type="gramEnd"/>
       <w:r>
-        <w:t xml:space="preserve"> are not included </w:t>
+        <w:t xml:space="preserve"> are not </w:t>
+      </w:r>
+      <w:proofErr w:type="gramStart"/>
+      <w:r>
+        <w:t xml:space="preserve">included </w:t>
       </w:r>
       <w:r>
-        <w:t xml:space="preserve"> in this document</w:t>
+        <w:t xml:space="preserve"> in</w:t>
+      </w:r>
+      <w:proofErr w:type="gramEnd"/>
+      <w:r>
+        <w:t xml:space="preserve"> this document</w:t>
       </w:r>
       <w:r>
         <w:t>.</w:t>

</xml_diff>